<commit_message>
jag földe med på lektionen
</commit_message>
<xml_diff>
--- a/dokumentation/Projektplan_mall.docx
+++ b/dokumentation/Projektplan_mall.docx
@@ -1839,31 +1839,133 @@
       </w:r>
       <w:bookmarkEnd w:id="6"/>
     </w:p>
+    <w:p/>
     <w:p>
       <w:pPr>
         <w:pStyle w:val="Rubrik2"/>
       </w:pPr>
       <w:bookmarkStart w:id="7" w:name="_Toc103152774"/>
       <w:r>
+        <w:lastRenderedPageBreak/>
         <w:t>Bilder</w:t>
       </w:r>
       <w:bookmarkEnd w:id="7"/>
     </w:p>
     <w:p>
       <w:r>
-        <w:t>Hur ska de olika skärmbilderna i programmet se ut</w:t>
-      </w:r>
-      <w:r>
-        <w:t>?</w:t>
+        <w:drawing>
+          <wp:anchor distT="0" distB="0" distL="114300" distR="114300" simplePos="0" relativeHeight="251658240" behindDoc="0" locked="0" layoutInCell="1" allowOverlap="1" wp14:anchorId="42EDDCF5" wp14:editId="46C3D0D8">
+            <wp:simplePos x="0" y="0"/>
+            <wp:positionH relativeFrom="margin">
+              <wp:posOffset>3112135</wp:posOffset>
+            </wp:positionH>
+            <wp:positionV relativeFrom="paragraph">
+              <wp:posOffset>10795</wp:posOffset>
+            </wp:positionV>
+            <wp:extent cx="3089910" cy="1810936"/>
+            <wp:effectExtent l="0" t="0" r="0" b="0"/>
+            <wp:wrapNone/>
+            <wp:docPr id="1034734067" name="Bildobjekt 1"/>
+            <wp:cNvGraphicFramePr>
+              <a:graphicFrameLocks xmlns:a="http://schemas.openxmlformats.org/drawingml/2006/main" noChangeAspect="1"/>
+            </wp:cNvGraphicFramePr>
+            <a:graphic xmlns:a="http://schemas.openxmlformats.org/drawingml/2006/main">
+              <a:graphicData uri="http://schemas.openxmlformats.org/drawingml/2006/picture">
+                <pic:pic xmlns:pic="http://schemas.openxmlformats.org/drawingml/2006/picture">
+                  <pic:nvPicPr>
+                    <pic:cNvPr id="1034734067" name=""/>
+                    <pic:cNvPicPr/>
+                  </pic:nvPicPr>
+                  <pic:blipFill>
+                    <a:blip r:embed="rId13"/>
+                    <a:stretch>
+                      <a:fillRect/>
+                    </a:stretch>
+                  </pic:blipFill>
+                  <pic:spPr>
+                    <a:xfrm>
+                      <a:off x="0" y="0"/>
+                      <a:ext cx="3090850" cy="1811487"/>
+                    </a:xfrm>
+                    <a:prstGeom prst="rect">
+                      <a:avLst/>
+                    </a:prstGeom>
+                  </pic:spPr>
+                </pic:pic>
+              </a:graphicData>
+            </a:graphic>
+            <wp14:sizeRelH relativeFrom="margin">
+              <wp14:pctWidth>0</wp14:pctWidth>
+            </wp14:sizeRelH>
+            <wp14:sizeRelV relativeFrom="margin">
+              <wp14:pctHeight>0</wp14:pctHeight>
+            </wp14:sizeRelV>
+          </wp:anchor>
+        </w:drawing>
+      </w:r>
+      <w:r>
+        <w:drawing>
+          <wp:anchor distT="0" distB="0" distL="114300" distR="114300" simplePos="0" relativeHeight="251659264" behindDoc="0" locked="0" layoutInCell="1" allowOverlap="1" wp14:anchorId="4C41A9D3" wp14:editId="7C8AFAF9">
+            <wp:simplePos x="0" y="0"/>
+            <wp:positionH relativeFrom="margin">
+              <wp:align>left</wp:align>
+            </wp:positionH>
+            <wp:positionV relativeFrom="paragraph">
+              <wp:posOffset>10795</wp:posOffset>
+            </wp:positionV>
+            <wp:extent cx="3093720" cy="1792478"/>
+            <wp:effectExtent l="0" t="0" r="0" b="0"/>
+            <wp:wrapNone/>
+            <wp:docPr id="1967241060" name="Bildobjekt 1"/>
+            <wp:cNvGraphicFramePr>
+              <a:graphicFrameLocks xmlns:a="http://schemas.openxmlformats.org/drawingml/2006/main" noChangeAspect="1"/>
+            </wp:cNvGraphicFramePr>
+            <a:graphic xmlns:a="http://schemas.openxmlformats.org/drawingml/2006/main">
+              <a:graphicData uri="http://schemas.openxmlformats.org/drawingml/2006/picture">
+                <pic:pic xmlns:pic="http://schemas.openxmlformats.org/drawingml/2006/picture">
+                  <pic:nvPicPr>
+                    <pic:cNvPr id="1967241060" name=""/>
+                    <pic:cNvPicPr/>
+                  </pic:nvPicPr>
+                  <pic:blipFill>
+                    <a:blip r:embed="rId14"/>
+                    <a:stretch>
+                      <a:fillRect/>
+                    </a:stretch>
+                  </pic:blipFill>
+                  <pic:spPr>
+                    <a:xfrm>
+                      <a:off x="0" y="0"/>
+                      <a:ext cx="3093720" cy="1792478"/>
+                    </a:xfrm>
+                    <a:prstGeom prst="rect">
+                      <a:avLst/>
+                    </a:prstGeom>
+                  </pic:spPr>
+                </pic:pic>
+              </a:graphicData>
+            </a:graphic>
+            <wp14:sizeRelH relativeFrom="margin">
+              <wp14:pctWidth>0</wp14:pctWidth>
+            </wp14:sizeRelH>
+            <wp14:sizeRelV relativeFrom="margin">
+              <wp14:pctHeight>0</wp14:pctHeight>
+            </wp14:sizeRelV>
+          </wp:anchor>
+        </w:drawing>
       </w:r>
     </w:p>
+    <w:p/>
+    <w:p/>
+    <w:p/>
+    <w:p/>
+    <w:p/>
     <w:p>
       <w:pPr>
         <w:pStyle w:val="Rubrik2"/>
       </w:pPr>
       <w:bookmarkStart w:id="8" w:name="_Toc103152775"/>
       <w:r>
-        <w:lastRenderedPageBreak/>
         <w:t>Navigering</w:t>
       </w:r>
       <w:bookmarkEnd w:id="8"/>
@@ -1875,9 +1977,6 @@
       <w:r>
         <w:t>i programmet</w:t>
       </w:r>
-      <w:r>
-        <w:t>?</w:t>
-      </w:r>
     </w:p>
     <w:p>
       <w:pPr>
@@ -1951,6 +2050,9 @@
     </w:p>
     <w:p>
       <w:r>
+        <w:rPr>
+          <w:noProof/>
+        </w:rPr>
         <w:drawing>
           <wp:inline distT="0" distB="0" distL="0" distR="0" wp14:anchorId="4B9C71B0" wp14:editId="4BC2413B">
             <wp:extent cx="3444538" cy="1798476"/>
@@ -1967,7 +2069,7 @@
                     <pic:cNvPicPr/>
                   </pic:nvPicPr>
                   <pic:blipFill>
-                    <a:blip r:embed="rId13"/>
+                    <a:blip r:embed="rId15"/>
                     <a:stretch>
                       <a:fillRect/>
                     </a:stretch>
@@ -2033,7 +2135,11 @@
       </w:r>
       <w:proofErr w:type="spellEnd"/>
       <w:r>
-        <w:t xml:space="preserve"> förfrågan tabellen innehåller också en längre beskrivning som lagras som en text</w:t>
+        <w:t xml:space="preserve"> förfrågan tabellen innehåller också </w:t>
+      </w:r>
+      <w:r>
+        <w:lastRenderedPageBreak/>
+        <w:t>en längre beskrivning som lagras som en text</w:t>
       </w:r>
       <w:r>
         <w:t xml:space="preserve"> i tabellen uppgifter är aktivitet id en främmande nyckel från tabellen aktiviteter.</w:t>
@@ -2075,7 +2181,6 @@
       </w:pPr>
       <w:bookmarkStart w:id="14" w:name="_Toc103152781"/>
       <w:r>
-        <w:lastRenderedPageBreak/>
         <w:t>Säkerhet</w:t>
       </w:r>
       <w:bookmarkEnd w:id="14"/>
@@ -2154,7 +2259,7 @@
     </w:p>
     <w:p/>
     <w:sectPr>
-      <w:footerReference w:type="default" r:id="rId14"/>
+      <w:footerReference w:type="default" r:id="rId16"/>
       <w:pgSz w:w="11906" w:h="16838" w:code="9"/>
       <w:pgMar w:top="1440" w:right="1639" w:bottom="1440" w:left="1639" w:header="720" w:footer="720" w:gutter="0"/>
       <w:pgNumType w:start="0"/>
@@ -4761,8 +4866,10 @@
     <w:rsid w:val="00413563"/>
     <w:rsid w:val="007D257D"/>
     <w:rsid w:val="00BF00B4"/>
+    <w:rsid w:val="00E63D63"/>
     <w:rsid w:val="00E73D72"/>
     <w:rsid w:val="00F5306C"/>
+    <w:rsid w:val="00FE2C15"/>
   </w:rsids>
   <m:mathPr>
     <m:mathFont m:val="Cambria Math"/>
@@ -5534,12 +5641,19 @@
 </file>
 
 <file path=customXml/item1.xml><?xml version="1.0" encoding="utf-8"?>
-<p:properties xmlns:p="http://schemas.microsoft.com/office/2006/metadata/properties" xmlns:xsi="http://www.w3.org/2001/XMLSchema-instance" xmlns:pc="http://schemas.microsoft.com/office/infopath/2007/PartnerControls">
-  <documentManagement/>
-</p:properties>
+<b:Sources xmlns:b="http://schemas.openxmlformats.org/officeDocument/2006/bibliography" xmlns="http://schemas.openxmlformats.org/officeDocument/2006/bibliography" SelectedStyle="\APASixthEditionOfficeOnline.xsl" StyleName="APA" Version="6"/>
 </file>
 
 <file path=customXml/item2.xml><?xml version="1.0" encoding="utf-8"?>
+<?mso-contentType ?>
+<FormTemplates xmlns="http://schemas.microsoft.com/sharepoint/v3/contenttype/forms">
+  <Display>DocumentLibraryForm</Display>
+  <Edit>DocumentLibraryForm</Edit>
+  <New>DocumentLibraryForm</New>
+</FormTemplates>
+</file>
+
+<file path=customXml/item3.xml><?xml version="1.0" encoding="utf-8"?>
 <ct:contentTypeSchema xmlns:ct="http://schemas.microsoft.com/office/2006/metadata/contentType" xmlns:ma="http://schemas.microsoft.com/office/2006/metadata/properties/metaAttributes" ct:_="" ma:_="" ma:contentTypeName="dokument" ma:contentTypeID="0x01010067B035B7DE360F49AC1E3E64A7BD4266" ma:contentTypeVersion="9" ma:contentTypeDescription="Skapa ett nytt dokument." ma:contentTypeScope="" ma:versionID="2b15be16484cc4125e56b4bc62a7d78a">
   <xsd:schema xmlns:xsd="http://www.w3.org/2001/XMLSchema" xmlns:xs="http://www.w3.org/2001/XMLSchema" xmlns:p="http://schemas.microsoft.com/office/2006/metadata/properties" xmlns:ns3="e726d1de-8eee-48d4-acc6-11f5952e6685" xmlns:ns4="7afd1d53-ab43-4087-8ee5-8d1641b94b01" targetNamespace="http://schemas.microsoft.com/office/2006/metadata/properties" ma:root="true" ma:fieldsID="07a74a5b6f94ee7a3fc8de3bd0e980eb" ns3:_="" ns4:_="">
     <xsd:import namespace="e726d1de-8eee-48d4-acc6-11f5952e6685"/>
@@ -5736,29 +5850,29 @@
 </ct:contentTypeSchema>
 </file>
 
-<file path=customXml/item3.xml><?xml version="1.0" encoding="utf-8"?>
-<?mso-contentType ?>
-<FormTemplates xmlns="http://schemas.microsoft.com/sharepoint/v3/contenttype/forms">
-  <Display>DocumentLibraryForm</Display>
-  <Edit>DocumentLibraryForm</Edit>
-  <New>DocumentLibraryForm</New>
-</FormTemplates>
-</file>
-
 <file path=customXml/item4.xml><?xml version="1.0" encoding="utf-8"?>
-<b:Sources xmlns:b="http://schemas.openxmlformats.org/officeDocument/2006/bibliography" xmlns="http://schemas.openxmlformats.org/officeDocument/2006/bibliography" SelectedStyle="\APASixthEditionOfficeOnline.xsl" StyleName="APA" Version="6"/>
+<p:properties xmlns:p="http://schemas.microsoft.com/office/2006/metadata/properties" xmlns:xsi="http://www.w3.org/2001/XMLSchema-instance" xmlns:pc="http://schemas.microsoft.com/office/infopath/2007/PartnerControls">
+  <documentManagement/>
+</p:properties>
 </file>
 
 <file path=customXml/itemProps1.xml><?xml version="1.0" encoding="utf-8"?>
-<ds:datastoreItem xmlns:ds="http://schemas.openxmlformats.org/officeDocument/2006/customXml" ds:itemID="{12E72A48-7A3C-4AA9-A41C-71D022C7FFC5}">
+<ds:datastoreItem xmlns:ds="http://schemas.openxmlformats.org/officeDocument/2006/customXml" ds:itemID="{F95BC9C0-4309-42B6-A692-27E3D4821FE6}">
   <ds:schemaRefs>
-    <ds:schemaRef ds:uri="http://schemas.microsoft.com/office/2006/metadata/properties"/>
-    <ds:schemaRef ds:uri="http://schemas.microsoft.com/office/infopath/2007/PartnerControls"/>
+    <ds:schemaRef ds:uri="http://schemas.openxmlformats.org/officeDocument/2006/bibliography"/>
   </ds:schemaRefs>
 </ds:datastoreItem>
 </file>
 
 <file path=customXml/itemProps2.xml><?xml version="1.0" encoding="utf-8"?>
+<ds:datastoreItem xmlns:ds="http://schemas.openxmlformats.org/officeDocument/2006/customXml" ds:itemID="{9DD392A4-9C7B-47E9-A2A7-2EC9259DC515}">
+  <ds:schemaRefs>
+    <ds:schemaRef ds:uri="http://schemas.microsoft.com/sharepoint/v3/contenttype/forms"/>
+  </ds:schemaRefs>
+</ds:datastoreItem>
+</file>
+
+<file path=customXml/itemProps3.xml><?xml version="1.0" encoding="utf-8"?>
 <ds:datastoreItem xmlns:ds="http://schemas.openxmlformats.org/officeDocument/2006/customXml" ds:itemID="{9E68415D-8571-4C4E-9D5B-26AF09ED893B}">
   <ds:schemaRefs>
     <ds:schemaRef ds:uri="http://schemas.microsoft.com/office/2006/metadata/contentType"/>
@@ -5777,18 +5891,11 @@
 </ds:datastoreItem>
 </file>
 
-<file path=customXml/itemProps3.xml><?xml version="1.0" encoding="utf-8"?>
-<ds:datastoreItem xmlns:ds="http://schemas.openxmlformats.org/officeDocument/2006/customXml" ds:itemID="{9DD392A4-9C7B-47E9-A2A7-2EC9259DC515}">
+<file path=customXml/itemProps4.xml><?xml version="1.0" encoding="utf-8"?>
+<ds:datastoreItem xmlns:ds="http://schemas.openxmlformats.org/officeDocument/2006/customXml" ds:itemID="{12E72A48-7A3C-4AA9-A41C-71D022C7FFC5}">
   <ds:schemaRefs>
-    <ds:schemaRef ds:uri="http://schemas.microsoft.com/sharepoint/v3/contenttype/forms"/>
-  </ds:schemaRefs>
-</ds:datastoreItem>
-</file>
-
-<file path=customXml/itemProps4.xml><?xml version="1.0" encoding="utf-8"?>
-<ds:datastoreItem xmlns:ds="http://schemas.openxmlformats.org/officeDocument/2006/customXml" ds:itemID="{F95BC9C0-4309-42B6-A692-27E3D4821FE6}">
-  <ds:schemaRefs>
-    <ds:schemaRef ds:uri="http://schemas.openxmlformats.org/officeDocument/2006/bibliography"/>
+    <ds:schemaRef ds:uri="http://schemas.microsoft.com/office/2006/metadata/properties"/>
+    <ds:schemaRef ds:uri="http://schemas.microsoft.com/office/infopath/2007/PartnerControls"/>
   </ds:schemaRefs>
 </ds:datastoreItem>
 </file>
</xml_diff>